<commit_message>
Adjusted website and added bakground photo
</commit_message>
<xml_diff>
--- a/Project1/Documentation.docx
+++ b/Project1/Documentation.docx
@@ -27,10 +27,7 @@
       </w:r>
       <w:proofErr w:type="gramEnd"/>
       <w:r>
-        <w:t xml:space="preserve"> each new task, I debugged my code using the provided test cases.</w:t>
-      </w:r>
-      <w:r>
-        <w:t xml:space="preserve"> </w:t>
+        <w:t xml:space="preserve"> each new task, I debugged my code using the provided test cases. </w:t>
       </w:r>
     </w:p>
     <w:p>
@@ -1028,7 +1025,11 @@
           <w:tcPr>
             <w:tcW w:w="715" w:type="dxa"/>
           </w:tcPr>
-          <w:p/>
+          <w:p>
+            <w:r>
+              <w:t>Pass</w:t>
+            </w:r>
+          </w:p>
         </w:tc>
       </w:tr>
       <w:tr>
@@ -1097,7 +1098,80 @@
           <w:tcPr>
             <w:tcW w:w="715" w:type="dxa"/>
           </w:tcPr>
-          <w:p/>
+          <w:p>
+            <w:r>
+              <w:t>Pass</w:t>
+            </w:r>
+          </w:p>
+        </w:tc>
+      </w:tr>
+      <w:tr>
+        <w:tc>
+          <w:tcPr>
+            <w:tcW w:w="1975" w:type="dxa"/>
+          </w:tcPr>
+          <w:p>
+            <w:pPr>
+              <w:pStyle w:val="ListParagraph"/>
+              <w:numPr>
+                <w:ilvl w:val="0"/>
+                <w:numId w:val="1"/>
+              </w:numPr>
+            </w:pPr>
+            <w:r>
+              <w:t>Lexemes.txt</w:t>
+            </w:r>
+          </w:p>
+        </w:tc>
+        <w:tc>
+          <w:tcPr>
+            <w:tcW w:w="1350" w:type="dxa"/>
+          </w:tcPr>
+          <w:p>
+            <w:r>
+              <w:t xml:space="preserve">Tests lexemes </w:t>
+            </w:r>
+            <w:r>
+              <w:lastRenderedPageBreak/>
+              <w:t>with no errors</w:t>
+            </w:r>
+          </w:p>
+        </w:tc>
+        <w:tc>
+          <w:tcPr>
+            <w:tcW w:w="1319" w:type="dxa"/>
+          </w:tcPr>
+          <w:p>
+            <w:r>
+              <w:lastRenderedPageBreak/>
+              <w:t xml:space="preserve">Prints the file to the </w:t>
+            </w:r>
+            <w:r>
+              <w:lastRenderedPageBreak/>
+              <w:t>terminal with Compiled Successfully at the end.</w:t>
+            </w:r>
+          </w:p>
+        </w:tc>
+        <w:tc>
+          <w:tcPr>
+            <w:tcW w:w="3991" w:type="dxa"/>
+          </w:tcPr>
+          <w:p>
+            <w:r>
+              <w:lastRenderedPageBreak/>
+              <w:t>Pasted below the table</w:t>
+            </w:r>
+          </w:p>
+        </w:tc>
+        <w:tc>
+          <w:tcPr>
+            <w:tcW w:w="715" w:type="dxa"/>
+          </w:tcPr>
+          <w:p>
+            <w:r>
+              <w:t>Pass</w:t>
+            </w:r>
+          </w:p>
         </w:tc>
       </w:tr>
     </w:tbl>
@@ -1108,7 +1182,6 @@
     </w:p>
     <w:p>
       <w:r>
-        <w:lastRenderedPageBreak/>
         <w:t>9. “make” command</w:t>
       </w:r>
       <w:r>
@@ -1207,6 +1280,53 @@
       </w:r>
     </w:p>
     <w:p>
+      <w:r>
+        <w:t>11.Lexemes.txt:</w:t>
+      </w:r>
+    </w:p>
+    <w:p>
+      <w:r>
+        <w:t xml:space="preserve"> </w:t>
+      </w:r>
+      <w:r>
+        <w:drawing>
+          <wp:inline distT="0" distB="0" distL="0" distR="0" wp14:anchorId="6E317DF5" wp14:editId="086390E4">
+            <wp:extent cx="782726" cy="4366820"/>
+            <wp:effectExtent l="0" t="0" r="0" b="0"/>
+            <wp:docPr id="772001376" name="Picture 1" descr="A blue background with white text&#10;&#10;AI-generated content may be incorrect."/>
+            <wp:cNvGraphicFramePr>
+              <a:graphicFrameLocks xmlns:a="http://schemas.openxmlformats.org/drawingml/2006/main" noChangeAspect="1"/>
+            </wp:cNvGraphicFramePr>
+            <a:graphic xmlns:a="http://schemas.openxmlformats.org/drawingml/2006/main">
+              <a:graphicData uri="http://schemas.openxmlformats.org/drawingml/2006/picture">
+                <pic:pic xmlns:pic="http://schemas.openxmlformats.org/drawingml/2006/picture">
+                  <pic:nvPicPr>
+                    <pic:cNvPr id="772001376" name="Picture 1" descr="A blue background with white text&#10;&#10;AI-generated content may be incorrect."/>
+                    <pic:cNvPicPr/>
+                  </pic:nvPicPr>
+                  <pic:blipFill>
+                    <a:blip r:embed="rId17"/>
+                    <a:stretch>
+                      <a:fillRect/>
+                    </a:stretch>
+                  </pic:blipFill>
+                  <pic:spPr>
+                    <a:xfrm>
+                      <a:off x="0" y="0"/>
+                      <a:ext cx="824972" cy="4602509"/>
+                    </a:xfrm>
+                    <a:prstGeom prst="rect">
+                      <a:avLst/>
+                    </a:prstGeom>
+                  </pic:spPr>
+                </pic:pic>
+              </a:graphicData>
+            </a:graphic>
+          </wp:inline>
+        </w:drawing>
+      </w:r>
+    </w:p>
+    <w:p>
       <w:pPr>
         <w:rPr>
           <w:sz w:val="28"/>
@@ -1218,6 +1338,7 @@
           <w:sz w:val="28"/>
           <w:szCs w:val="28"/>
         </w:rPr>
+        <w:lastRenderedPageBreak/>
         <w:t>Lessons Learned</w:t>
       </w:r>
     </w:p>
@@ -1237,7 +1358,7 @@
       </w:r>
     </w:p>
     <w:sectPr>
-      <w:headerReference w:type="default" r:id="rId17"/>
+      <w:headerReference w:type="default" r:id="rId18"/>
       <w:pgSz w:w="12240" w:h="15840"/>
       <w:pgMar w:top="1440" w:right="1440" w:bottom="1440" w:left="1440" w:header="720" w:footer="720" w:gutter="0"/>
       <w:cols w:space="720"/>
@@ -2015,6 +2136,7 @@
   <w:style w:type="character" w:default="1" w:styleId="DefaultParagraphFont">
     <w:name w:val="Default Paragraph Font"/>
     <w:uiPriority w:val="1"/>
+    <w:semiHidden/>
     <w:unhideWhenUsed/>
   </w:style>
   <w:style w:type="table" w:default="1" w:styleId="TableNormal">

</xml_diff>